<commit_message>
auto: session 2026-09-13 17:54
Co-Authored-By: Claude Opus 4.8 (1M context) <noreply@anthropic.com>
</commit_message>
<xml_diff>
--- a/AP/Boc-thong-tin-phong-van-AP.docx
+++ b/AP/Boc-thong-tin-phong-van-AP.docx
@@ -34,7 +34,7 @@
           <w:iCs/>
           <w:color w:val="555555"/>
         </w:rPr>
-        <w:t xml:space="preserve">Phương pháp: chuyển giọng nói sang văn bản bằng Whisper (local, model small), sau đó biên tập lại cho mạch lạc.</w:t>
+        <w:t xml:space="preserve">Phương pháp: chuyển giọng nói sang văn bản bằng Whisper (local, model small), biên tập lại cho mạch lạc, sau đó ĐỐI CHIẾU và sửa lại theo 3 tài liệu chính thức có sẵn trong thư mục dự án: hồ sơ giảng viên/tư vấn (Trainer_Executive Coach_Consultant Profile), bộ Credential A&amp;P x DDI, và bộ Credential Presentation A&amp;P Việt Nam.</w:t>
       </w:r>
     </w:p>
     <w:p>
@@ -55,7 +55,7 @@
         <w:spacing w:after="160"/>
       </w:pPr>
       <w:r>
-        <w:t xml:space="preserve">Bản ghi âm có nhiều đoạn khó nghe (giọng nhanh, nhiều thuật ngữ tiếng Anh xen tiếng Việt) nên công cụ chuyển giọng nói ra chữ bị sai khá nhiều ở TÊN RIÊNG (tên người, tên công ty, tên khách hàng) và một số SỐ LIỆU. Nội dung dưới đây đã được suy luận/làm mạch lạc lại từ bản gốc lỗi, nhưng các mục đánh dấu [CẦN ĐỐI CHIẾU] nên nghe lại file gốc để xác nhận trước khi dùng cho mục đích chính thức (báo chí, hợp đồng...).</w:t>
+        <w:t xml:space="preserve">Tên riêng, chức danh, số liệu về A&amp;P Việt Nam và DDI trong bản này đã được đối chiếu và sửa lại theo đúng 3 file PDF chính thức có sẵn trong thư mục dự án. Phần NỘI DUNG QUAN ĐIỂM/CHIA SẺ của người được phỏng vấn (các case study, quan điểm, câu chuyện...) vẫn giữ theo bản ghi âm - phần này không có tài liệu đối chiếu nên vẫn có thể lệch ít nhiều so với nguyên văn do chất lượng nhận dạng giọng nói; các chỗ còn nghi vấn được đánh dấu [CẦN ĐỐI CHIẾU] ở cuối tài liệu.</w:t>
       </w:r>
     </w:p>
     <w:p>
@@ -79,7 +79,7 @@
         <w:t xml:space="preserve">Người được phỏng vấn: </w:t>
       </w:r>
       <w:r>
-        <w:t xml:space="preserve">Giám đốc điều hành (CEO) của A&amp;P Việt Nam [tên riêng nghe như "chị Lài" - CẦN ĐỐI CHIẾU chính tả].</w:t>
+        <w:t xml:space="preserve">Bà Võ Thị Thanh Loan - Giám đốc Điều hành A&amp;P Việt Nam.</w:t>
       </w:r>
     </w:p>
     <w:p>
@@ -91,10 +91,10 @@
           <w:b/>
           <w:bCs/>
         </w:rPr>
-        <w:t xml:space="preserve">Vai trò hiện tại: </w:t>
-      </w:r>
-      <w:r>
-        <w:t xml:space="preserve">Giám đốc điều hành A&amp;P Việt Nam; đồng thời là nghiên cứu sinh tiến sĩ (chương trình DBA - Doctor of Business Administration); tham gia trực tiếp với vai trò chuyên gia/cố vấn (đồng hành cùng doanh nghiệp trong vai trò cố vấn chiến lược, chuyên gia tư vấn nhân sự); phụ trách thêm các sản phẩm đào tạo điều hành (executive coaching) và huấn luyện đội nhóm.</w:t>
+        <w:t xml:space="preserve">Chức danh / chứng chỉ chuyên môn: </w:t>
+      </w:r>
+      <w:r>
+        <w:t xml:space="preserve">Nghiên cứu sinh Tiến sĩ Quản trị Kinh doanh (DBA) tại Asian Institute of Technology (AIT); Certified Executive Coach &amp; Master Facilitator (Center for Executive Coaching); Certified Project Management Professional - PMP® (PMI); DDI Certified Facilitator &amp; Business Impact Leadership: Mid-Level Leaders Series® Facilitator (DDI); Associate Certified Coach - ACC™ (ICF).</w:t>
       </w:r>
     </w:p>
     <w:p>
@@ -109,7 +109,7 @@
         <w:t xml:space="preserve">Kinh nghiệm trước khi lập A&amp;P: </w:t>
       </w:r>
       <w:r>
-        <w:t xml:space="preserve">18 năm làm việc tại Coca-Cola, từng đảm nhiệm vai trò lãnh đạo mảng kinh doanh (commercial) trước khi chuyển sang phụ trách nhân sự / phát triển tài năng (talent development). Rời Coca-Cola để thành lập A&amp;P Việt Nam.</w:t>
+        <w:t xml:space="preserve">Hơn 22 năm kinh nghiệm trong lĩnh vực phát triển năng lực lãnh đạo, xây dựng tổ chức và dẫn dắt chuyển đổi hiệu suất đội ngũ; từng đảm nhiệm nhiều vị trí quản lý cấp cao mảng Nhân sự và Thương mại tại các tập đoàn đa quốc gia: Abbott, GSK, MSD, Liberty Insurance, AIA và DKSH. Trong ghi âm, bà có nhắc khoảng 18 năm làm việc trong môi trường tập đoàn ("corporate") trước khi chuyển hẳn sang mảng nhân sự/phát triển tài năng rồi thành lập A&amp;P - không nhắc tên một công ty cụ thể nào là "18 năm", nên KHÔNG quy hết 18 năm này cho một công ty duy nhất trong danh sách trên.</w:t>
       </w:r>
     </w:p>
     <w:p>
@@ -121,10 +121,10 @@
           <w:b/>
           <w:bCs/>
         </w:rPr>
-        <w:t xml:space="preserve">Năm thành lập A&amp;P Việt Nam: </w:t>
-      </w:r>
-      <w:r>
-        <w:t xml:space="preserve">2016 (mốc phỏng vấn: kỷ niệm 10 năm hoạt động).</w:t>
+        <w:t xml:space="preserve">Học vấn: </w:t>
+      </w:r>
+      <w:r>
+        <w:t xml:space="preserve">MBA in Business Administration - Đại học Kinh tế TP.HCM (2006); Cử nhân Ngoại thương và Cử nhân tiếng Anh - Đại học Đà Nẵng (2000-2001).</w:t>
       </w:r>
     </w:p>
     <w:p>
@@ -136,10 +136,10 @@
           <w:b/>
           <w:bCs/>
         </w:rPr>
-        <w:t xml:space="preserve">Lĩnh vực hoạt động: </w:t>
-      </w:r>
-      <w:r>
-        <w:t xml:space="preserve">Tư vấn và đào tạo phát triển lãnh đạo (leadership development), phát triển tổ chức (organization development), phát triển tài năng (talent development) cho doanh nghiệp (mô hình B2B).</w:t>
+        <w:t xml:space="preserve">Về công ty A&amp;P Việt Nam: </w:t>
+      </w:r>
+      <w:r>
+        <w:t xml:space="preserve">Công ty tư vấn và đào tạo doanh nghiệp, chuyên về phát triển năng lực lãnh đạo (leadership development), xây dựng đội ngũ thành tích cao và tối ưu hóa nguồn lực tổ chức. Hơn 95% đối tác là các tập đoàn đa quốc gia và công ty quy mô lớn tại Việt Nam; thực hiện hơn 150 dự án tư vấn và đào tạo doanh nghiệp mỗi năm. Theo lời kể trong phỏng vấn, công ty thành lập năm 2016 (mốc phỏng vấn: kỷ niệm 10 năm hoạt động - số năm thành lập không có trong 3 tài liệu chính thức, chỉ dựa theo lời kể).</w:t>
       </w:r>
     </w:p>
     <w:p>
@@ -151,25 +151,85 @@
           <w:b/>
           <w:bCs/>
         </w:rPr>
-        <w:t xml:space="preserve">Đối tác chiến lược: </w:t>
-      </w:r>
-      <w:r>
-        <w:t xml:space="preserve">DDI (Development Dimensions International) - tổ chức quốc tế khoảng 50 năm kinh nghiệm về phát triển lãnh đạo, có khoảng 3 triệu lãnh đạo trên toàn cầu từng học chương trình của DDI. A&amp;P là đối tác triển khai giải pháp của DDI tại Việt Nam.</w:t>
-      </w:r>
-    </w:p>
-    <w:p>
-      <w:pPr>
-        <w:spacing w:after="200"/>
+        <w:t xml:space="preserve">Slogan công ty: </w:t>
+      </w:r>
+      <w:r>
+        <w:t xml:space="preserve">"OUR EXPERTISE. YOUR GROWTH."</w:t>
+      </w:r>
+    </w:p>
+    <w:p>
+      <w:pPr>
+        <w:spacing w:after="100"/>
       </w:pPr>
       <w:r>
         <w:rPr>
           <w:b/>
           <w:bCs/>
         </w:rPr>
-        <w:t xml:space="preserve">Slogan công ty: </w:t>
-      </w:r>
-      <w:r>
-        <w:t xml:space="preserve">"Our expertise to grow" [CẦN ĐỐI CHIẾU chính tả].</w:t>
+        <w:t xml:space="preserve">Sứ mệnh: </w:t>
+      </w:r>
+      <w:r>
+        <w:t xml:space="preserve">Thay đổi nhận thức - Nâng cao năng lực - Phát triển trường tồn.</w:t>
+      </w:r>
+    </w:p>
+    <w:p>
+      <w:pPr>
+        <w:spacing w:after="100"/>
+      </w:pPr>
+      <w:r>
+        <w:rPr>
+          <w:b/>
+          <w:bCs/>
+        </w:rPr>
+        <w:t xml:space="preserve">Giá trị cốt lõi: </w:t>
+      </w:r>
+      <w:r>
+        <w:t xml:space="preserve">Chuyên nghiệp; Đề cao chữ tín; Lấy khách hàng làm trọng tâm; Tiên phong trong đổi mới - sáng tạo.</w:t>
+      </w:r>
+    </w:p>
+    <w:p>
+      <w:pPr>
+        <w:spacing w:after="100"/>
+      </w:pPr>
+      <w:r>
+        <w:rPr>
+          <w:b/>
+          <w:bCs/>
+        </w:rPr>
+        <w:t xml:space="preserve">4 nhóm dịch vụ chính: </w:t>
+      </w:r>
+      <w:r>
+        <w:t xml:space="preserve">(1) Giải pháp đào tạo dành cho doanh nghiệp; (2) Giải pháp huấn luyện dành cho lãnh đạo - quản lý; (3) Giải pháp dẫn dắt - điều phối dành cho doanh nghiệp; (4) Tư vấn giải pháp dành cho doanh nghiệp (gồm giải pháp phát triển nhân tài, thiết lập lộ trình nghề nghiệp, xây dựng mô hình đánh giá &amp; phát triển lực lượng kế thừa).</w:t>
+      </w:r>
+    </w:p>
+    <w:p>
+      <w:pPr>
+        <w:spacing w:after="100"/>
+      </w:pPr>
+      <w:r>
+        <w:rPr>
+          <w:b/>
+          <w:bCs/>
+        </w:rPr>
+        <w:t xml:space="preserve">Đối tác chiến lược: </w:t>
+      </w:r>
+      <w:r>
+        <w:t xml:space="preserve">DDI (Development Dimensions International) - công ty tư vấn lãnh đạo toàn cầu, hơn 50 năm kinh nghiệm nghiên cứu khoa học lãnh đạo; hơn 75% đối tác của DDI là các công ty thuộc Fortune 500; khoảng 3 triệu lãnh đạo/quản lý trên toàn cầu được DDI đào tạo MỖI NĂM; được TrainingIndustry.com xếp vào Top 20 công ty đào tạo lãnh đạo hàng đầu liên tiếp các năm 2023 và 2024; được Forbes 2024 vinh danh là một trong những nhà tuyển dụng cỡ vừa tốt nhất nước Mỹ. A&amp;P Việt Nam là đối tác triển khai giải pháp phát triển lãnh đạo của DDI tại thị trường Việt Nam.</w:t>
+      </w:r>
+    </w:p>
+    <w:p>
+      <w:pPr>
+        <w:spacing w:after="200"/>
+      </w:pPr>
+      <w:r>
+        <w:rPr>
+          <w:b/>
+          <w:bCs/>
+        </w:rPr>
+        <w:t xml:space="preserve">Địa chỉ / liên hệ: </w:t>
+      </w:r>
+      <w:r>
+        <w:t xml:space="preserve">36 Mạc Đĩnh Chi, Phường Đa Kao, Quận 1, TP.HCM. Email: services@apconsulting.vn. Điện thoại: (+84) 28 2253 7763. Website: www.apconsulting.vn.</w:t>
       </w:r>
     </w:p>
     <w:p>
@@ -213,7 +273,7 @@
         <w:spacing w:after="80"/>
       </w:pPr>
       <w:r>
-        <w:t xml:space="preserve">Kinh nghiệm 2 vai trò trái ngược tại Coca-Cola giúp hình thành góc nhìn này: (1) vai trò lãnh đạo kinh doanh/thương mại - hàng ngày đối mặt áp lực thị trường, tăng trưởng, thị phần; (2) vai trò lãnh đạo nhân sự - phụ trách phát triển con người, phát triển tài năng.</w:t>
+        <w:t xml:space="preserve">Kinh nghiệm 2 vai trò trái ngược trong môi trường tập đoàn đa quốc gia giúp hình thành góc nhìn này: (1) vai trò lãnh đạo kinh doanh/thương mại - hàng ngày đối mặt áp lực thị trường, tăng trưởng, thị phần; (2) vai trò lãnh đạo nhân sự - phụ trách phát triển con người, phát triển tài năng.</w:t>
       </w:r>
     </w:p>
     <w:p>
@@ -648,7 +708,7 @@
         <w:spacing w:after="80"/>
       </w:pPr>
       <w:r>
-        <w:t xml:space="preserve">Ví dụ đối tác gắn bó lâu năm được nhắc tới: một tập đoàn/thương hiệu lớn quốc tế [nghe như "Skoroski" - CẦN ĐỐI CHIẾU tên chính xác], đã đồng hành nhiều năm qua các dự án phát triển nhân tài.</w:t>
+        <w:t xml:space="preserve">Ví dụ đối tác gắn bó lâu năm được nhắc tới: một tập đoàn/thương hiệu lớn quốc tế [tên nghe không rõ, phát âm gần giống "Skoroski" - KHÔNG khớp với danh sách khách hàng nêu tên trong hồ sơ chính thức của A&amp;P, có thể là một tên hiệu khác hoặc bị đọc lệch; người được phỏng vấn cũng chủ động không muốn nêu tên cụ thể, nên khi viết bài giữ theo tinh thần ẩn danh, không cần cố xác định đúng tên].</w:t>
       </w:r>
     </w:p>
     <w:p>
@@ -696,7 +756,7 @@
         <w:spacing w:after="80"/>
       </w:pPr>
       <w:r>
-        <w:t xml:space="preserve">Vì sao chọn DDI: DDI có khoảng 50 năm kinh nghiệm quốc tế, giải pháp phát triển lãnh đạo dựa trên nền tảng nghiên cứu khoa học chuyên sâu về lãnh đạo và tổ chức, đã đào tạo khoảng 3 triệu lãnh đạo trên toàn cầu; danh mục giải pháp đầy đủ từ đánh giá lãnh đạo (leadership assessment) đến phát triển lãnh đạo (leadership development) và cá nhân hóa lộ trình phát triển.</w:t>
+        <w:t xml:space="preserve">Vì sao chọn DDI: hơn 50 năm kinh nghiệm quốc tế, giải pháp phát triển lãnh đạo dựa trên nền tảng nghiên cứu khoa học chuyên sâu về lãnh đạo và tổ chức, khoảng 3 triệu lãnh đạo/quản lý trên toàn cầu được DDI đào tạo mỗi năm; danh mục giải pháp đầy đủ từ đánh giá lãnh đạo (leadership assessment) đến phát triển lãnh đạo (leadership development) và cá nhân hóa lộ trình phát triển.</w:t>
       </w:r>
     </w:p>
     <w:p>
@@ -1118,7 +1178,7 @@
         <w:spacing w:after="80"/>
       </w:pPr>
       <w:r>
-        <w:t xml:space="preserve">Ưu tiên 3 - Đầu tư cho chất lượng giải pháp/chương trình: đảm bảo các giải pháp/chương trình phải đủ chiều sâu, đáp ứng đúng nhu cầu (nhu cầu thật) của doanh nghiệp khách hàng - đây là nền tảng để chứng minh giá trị "our expertise to grow" qua thời gian.</w:t>
+        <w:t xml:space="preserve">Ưu tiên 3 - Đầu tư cho chất lượng giải pháp/chương trình: đảm bảo các giải pháp/chương trình phải đủ chiều sâu, đáp ứng đúng nhu cầu (nhu cầu thật) của doanh nghiệp khách hàng - đây là nền tảng để chứng minh giá trị "Our expertise. Your growth." qua thời gian.</w:t>
       </w:r>
     </w:p>
     <w:p>
@@ -1153,85 +1213,142 @@
         <w:spacing w:after="150" w:before="300"/>
       </w:pPr>
       <w:r>
-        <w:t xml:space="preserve">10. Danh sách [CẦN ĐỐI CHIẾU] khi biên tập lại</w:t>
-      </w:r>
-    </w:p>
-    <w:p>
-      <w:pPr>
-        <w:pStyle w:val="ListParagraph"/>
-        <w:numPr>
-          <w:ilvl w:val="0"/>
-          <w:numId w:val="1"/>
-        </w:numPr>
-        <w:spacing w:after="80"/>
-      </w:pPr>
-      <w:r>
-        <w:t xml:space="preserve">Tên chính xác của người được phỏng vấn (nghe như "chị Lài").</w:t>
-      </w:r>
-    </w:p>
-    <w:p>
-      <w:pPr>
-        <w:pStyle w:val="ListParagraph"/>
-        <w:numPr>
-          <w:ilvl w:val="0"/>
-          <w:numId w:val="1"/>
-        </w:numPr>
-        <w:spacing w:after="80"/>
-      </w:pPr>
-      <w:r>
-        <w:t xml:space="preserve">Chính tả chuẩn tên công ty "A&amp;P Việt Nam" (bị nhận dạng sai thành nhiều biến thể: AMP/MP/AMB/AVB/AMV/EMT/IMP/NB).</w:t>
-      </w:r>
-    </w:p>
-    <w:p>
-      <w:pPr>
-        <w:pStyle w:val="ListParagraph"/>
-        <w:numPr>
-          <w:ilvl w:val="0"/>
-          <w:numId w:val="1"/>
-        </w:numPr>
-        <w:spacing w:after="80"/>
-      </w:pPr>
-      <w:r>
-        <w:t xml:space="preserve">Tên khách hàng/đối tác lớn được nhắc tới, nghe như "Skoroski" - có thể là tên thương hiệu quốc tế bị nhận dạng sai, cần nghe lại đoạn phút ~1:22 của PV 2 để xác nhận (lưu ý: chính người được phỏng vấn có nói KHÔNG muốn nêu tên khách hàng cụ thể, nên khi biên tập bài viết cũng cần giữ nguyên tắc ẩn danh này).</w:t>
-      </w:r>
-    </w:p>
-    <w:p>
-      <w:pPr>
-        <w:pStyle w:val="ListParagraph"/>
-        <w:numPr>
-          <w:ilvl w:val="0"/>
-          <w:numId w:val="1"/>
-        </w:numPr>
-        <w:spacing w:after="80"/>
-      </w:pPr>
-      <w:r>
-        <w:t xml:space="preserve">Slogan công ty "Our expertise to grow" - nghe chưa thật rõ, cần xác nhận lại nguyên văn.</w:t>
-      </w:r>
-    </w:p>
-    <w:p>
-      <w:pPr>
-        <w:pStyle w:val="ListParagraph"/>
-        <w:numPr>
-          <w:ilvl w:val="0"/>
-          <w:numId w:val="1"/>
-        </w:numPr>
-        <w:spacing w:after="80"/>
-      </w:pPr>
-      <w:r>
-        <w:t xml:space="preserve">Tên chương trình tiến sĩ đang theo học (nghe như liên quan "Quản trị kinh doanh").</w:t>
-      </w:r>
-    </w:p>
-    <w:p>
-      <w:pPr>
-        <w:pStyle w:val="ListParagraph"/>
-        <w:numPr>
-          <w:ilvl w:val="0"/>
-          <w:numId w:val="1"/>
-        </w:numPr>
-        <w:spacing w:after="80"/>
-      </w:pPr>
-      <w:r>
-        <w:t xml:space="preserve">Số liệu "khoảng 3 triệu lãnh đạo" và "khoảng 50 năm" của DDI - đây là số liệu do người được phỏng vấn tự nêu, nên đối chiếu thêm với tài liệu chính thức của DDI trước khi đưa vào bài viết chính thức.</w:t>
+        <w:t xml:space="preserve">10. Đã đối chiếu / vẫn còn [CẦN ĐỐI CHIẾU]</w:t>
+      </w:r>
+    </w:p>
+    <w:p>
+      <w:pPr>
+        <w:pStyle w:val="Heading2"/>
+        <w:spacing w:after="120" w:before="240"/>
+      </w:pPr>
+      <w:r>
+        <w:t xml:space="preserve">10.1. Đã xác nhận đúng theo 3 tài liệu chính thức trong thư mục dự án</w:t>
+      </w:r>
+    </w:p>
+    <w:p>
+      <w:pPr>
+        <w:pStyle w:val="ListParagraph"/>
+        <w:numPr>
+          <w:ilvl w:val="0"/>
+          <w:numId w:val="1"/>
+        </w:numPr>
+        <w:spacing w:after="80"/>
+      </w:pPr>
+      <w:r>
+        <w:t xml:space="preserve">Tên người được phỏng vấn: Võ Thị Thanh Loan (không phải "chị Lài" như nghe nhầm ban đầu).</w:t>
+      </w:r>
+    </w:p>
+    <w:p>
+      <w:pPr>
+        <w:pStyle w:val="ListParagraph"/>
+        <w:numPr>
+          <w:ilvl w:val="0"/>
+          <w:numId w:val="1"/>
+        </w:numPr>
+        <w:spacing w:after="80"/>
+      </w:pPr>
+      <w:r>
+        <w:t xml:space="preserve">Tên công ty: A&amp;P Việt Nam (bản ghi âm bị nhận dạng sai thành nhiều biến thể: AMP/MP/AMB/AVB/AMV/EMT/IMP/NB).</w:t>
+      </w:r>
+    </w:p>
+    <w:p>
+      <w:pPr>
+        <w:pStyle w:val="ListParagraph"/>
+        <w:numPr>
+          <w:ilvl w:val="0"/>
+          <w:numId w:val="1"/>
+        </w:numPr>
+        <w:spacing w:after="80"/>
+      </w:pPr>
+      <w:r>
+        <w:t xml:space="preserve">Slogan: "OUR EXPERTISE. YOUR GROWTH." (không phải "our expertise to grow").</w:t>
+      </w:r>
+    </w:p>
+    <w:p>
+      <w:pPr>
+        <w:pStyle w:val="ListParagraph"/>
+        <w:numPr>
+          <w:ilvl w:val="0"/>
+          <w:numId w:val="1"/>
+        </w:numPr>
+        <w:spacing w:after="80"/>
+      </w:pPr>
+      <w:r>
+        <w:t xml:space="preserve">Chương trình tiến sĩ đang theo học: DBA - Tiến sĩ Quản trị Kinh doanh, tại Asian Institute of Technology (AIT).</w:t>
+      </w:r>
+    </w:p>
+    <w:p>
+      <w:pPr>
+        <w:pStyle w:val="ListParagraph"/>
+        <w:numPr>
+          <w:ilvl w:val="0"/>
+          <w:numId w:val="1"/>
+        </w:numPr>
+        <w:spacing w:after="80"/>
+      </w:pPr>
+      <w:r>
+        <w:t xml:space="preserve">Số liệu DDI: hơn 50 năm kinh nghiệm, khoảng 3 triệu lãnh đạo/quản lý được đào tạo MỖI NĂM (không phải tổng số cộng dồn), hơn 75% đối tác thuộc Fortune 500 - theo đúng số liệu DDI công bố (nguồn: © Development Dimensions International, Inc., 2025).</w:t>
+      </w:r>
+    </w:p>
+    <w:p>
+      <w:pPr>
+        <w:pStyle w:val="ListParagraph"/>
+        <w:numPr>
+          <w:ilvl w:val="0"/>
+          <w:numId w:val="1"/>
+        </w:numPr>
+        <w:spacing w:after="80"/>
+      </w:pPr>
+      <w:r>
+        <w:t xml:space="preserve">Danh sách công ty bà Thanh Loan từng làm việc trước A&amp;P: Abbott, GSK, MSD, Liberty Insurance, AIA, DKSH (không phải Coca-Cola).</w:t>
+      </w:r>
+    </w:p>
+    <w:p>
+      <w:pPr>
+        <w:pStyle w:val="Heading2"/>
+        <w:spacing w:after="120" w:before="240"/>
+      </w:pPr>
+      <w:r>
+        <w:t xml:space="preserve">10.2. Vẫn còn [CẦN ĐỐI CHIẾU] - không có trong 3 tài liệu, phải hỏi lại hoặc nghe lại băng</w:t>
+      </w:r>
+    </w:p>
+    <w:p>
+      <w:pPr>
+        <w:pStyle w:val="ListParagraph"/>
+        <w:numPr>
+          <w:ilvl w:val="0"/>
+          <w:numId w:val="1"/>
+        </w:numPr>
+        <w:spacing w:after="80"/>
+      </w:pPr>
+      <w:r>
+        <w:t xml:space="preserve">Tên khách hàng/đối tác lớn được nhắc tới ở mục 4.1, nghe như "Skoroski" - không khớp với bất kỳ tên nào trong danh sách khách hàng của A&amp;P nêu trong hồ sơ chính thức; người được phỏng vấn cũng chủ động không muốn nêu tên cụ thể nên có thể không cần truy tiếp.</w:t>
+      </w:r>
+    </w:p>
+    <w:p>
+      <w:pPr>
+        <w:pStyle w:val="ListParagraph"/>
+        <w:numPr>
+          <w:ilvl w:val="0"/>
+          <w:numId w:val="1"/>
+        </w:numPr>
+        <w:spacing w:after="80"/>
+      </w:pPr>
+      <w:r>
+        <w:t xml:space="preserve">Năm thành lập A&amp;P Việt Nam (2016) và mốc "10 năm hoạt động" - chỉ dựa theo lời kể trong băng ghi âm, 3 tài liệu chính thức không ghi rõ năm thành lập, nên xác nhận lại với A&amp;P trước khi đưa vào bài chính thức (đặc biệt nếu bài viết dùng đúng dịp kỷ niệm 10 năm).</w:t>
+      </w:r>
+    </w:p>
+    <w:p>
+      <w:pPr>
+        <w:pStyle w:val="ListParagraph"/>
+        <w:numPr>
+          <w:ilvl w:val="0"/>
+          <w:numId w:val="1"/>
+        </w:numPr>
+        <w:spacing w:after="80"/>
+      </w:pPr>
+      <w:r>
+        <w:t xml:space="preserve">Toàn bộ nội dung case study, quan điểm, câu chuyện cá nhân (mục 2, 3, 5, 6, 7, 8, 9) là DIỄN GIẢI LẠI từ bản ghi âm chất lượng nhận dạng kém - nên xem đây là bản nháp ý chính để viết bài, không trích dẫn nguyên văn như một câu quote chính xác 100% nếu chưa nghe lại đối chiếu từng câu.</w:t>
       </w:r>
     </w:p>
     <w:sectPr>

</xml_diff>